<commit_message>
Restore reporting modules and complete environment migration
</commit_message>
<xml_diff>
--- a/Sales_Analytics_Dashboard_Project_Recap.docx
+++ b/Sales_Analytics_Dashboard_Project_Recap.docx
@@ -9,8 +9,6 @@
       <w:r>
         <w:t>Sales Analytics Dashboard Project - Progress Recap</w:t>
       </w:r>
-      <w:bookmarkStart w:id="0" w:name="_GoBack"/>
-      <w:bookmarkEnd w:id="0"/>
     </w:p>
     <w:p>
       <w:pPr>
@@ -44,10 +42,7 @@
         <w:pStyle w:val="ListNumber"/>
       </w:pPr>
       <w:r>
-        <w:t>C</w:t>
-      </w:r>
-      <w:r>
-        <w:t>reated synthetic sales dataset and analysis pipeline.</w:t>
+        <w:t>Created synthetic sales dataset and analysis pipeline.</w:t>
       </w:r>
     </w:p>
     <w:p>
@@ -55,10 +50,7 @@
         <w:pStyle w:val="ListNumber"/>
       </w:pPr>
       <w:r>
-        <w:t xml:space="preserve">Implemented data cleaning, KPIs, charts, customer segmentation, CLV </w:t>
-      </w:r>
-      <w:r>
-        <w:t>and insights.</w:t>
+        <w:t>Implemented data cleaning, KPIs, charts, customer segmentation, CLV and insights.</w:t>
       </w:r>
     </w:p>
     <w:p>
@@ -98,10 +90,7 @@
         <w:pStyle w:val="ListNumber"/>
       </w:pPr>
       <w:r>
-        <w:t>Implemented region-based data f</w:t>
-      </w:r>
-      <w:r>
-        <w:t>iltering.</w:t>
+        <w:t>Implemented region-based data filtering.</w:t>
       </w:r>
     </w:p>
     <w:p>
@@ -229,10 +218,7 @@
         <w:pStyle w:val="ListBullet"/>
       </w:pPr>
       <w:r>
-        <w:t xml:space="preserve">Streamlit </w:t>
-      </w:r>
-      <w:r>
-        <w:t>forms, session state and navigation</w:t>
+        <w:t>Streamlit forms, session state and navigation</w:t>
       </w:r>
     </w:p>
     <w:p>
@@ -277,10 +263,7 @@
     </w:p>
     <w:p>
       <w:r>
-        <w:t>The application now includes secure authentication, user administration, password management, role and r</w:t>
-      </w:r>
-      <w:r>
-        <w:t>egion permissions, reporting features, and a fully tested password reset workflow.</w:t>
+        <w:t>The application now includes secure authentication, user administration, password management, role and region permissions, reporting features, and a fully tested password reset workflow.</w:t>
       </w:r>
     </w:p>
     <w:p>
@@ -330,6 +313,55 @@
       <w:r>
         <w:t>Automated tests and documentation</w:t>
       </w:r>
+    </w:p>
+    <w:p>
+      <w:pPr>
+        <w:pStyle w:val="ListBullet"/>
+        <w:numPr>
+          <w:ilvl w:val="0"/>
+          <w:numId w:val="0"/>
+        </w:numPr>
+      </w:pPr>
+      <w:bookmarkStart w:id="0" w:name="_GoBack"/>
+      <w:r>
+        <w:lastRenderedPageBreak/>
+        <w:drawing>
+          <wp:inline distT="0" distB="0" distL="0" distR="0" wp14:anchorId="114390BB" wp14:editId="03D1445D">
+            <wp:extent cx="5486400" cy="5057140"/>
+            <wp:effectExtent l="0" t="0" r="0" b="0"/>
+            <wp:docPr id="1" name="Picture 1"/>
+            <wp:cNvGraphicFramePr>
+              <a:graphicFrameLocks xmlns:a="http://schemas.openxmlformats.org/drawingml/2006/main" noChangeAspect="1"/>
+            </wp:cNvGraphicFramePr>
+            <a:graphic xmlns:a="http://schemas.openxmlformats.org/drawingml/2006/main">
+              <a:graphicData uri="http://schemas.openxmlformats.org/drawingml/2006/picture">
+                <pic:pic xmlns:pic="http://schemas.openxmlformats.org/drawingml/2006/picture">
+                  <pic:nvPicPr>
+                    <pic:cNvPr id="1" name=""/>
+                    <pic:cNvPicPr/>
+                  </pic:nvPicPr>
+                  <pic:blipFill>
+                    <a:blip r:embed="rId6"/>
+                    <a:stretch>
+                      <a:fillRect/>
+                    </a:stretch>
+                  </pic:blipFill>
+                  <pic:spPr>
+                    <a:xfrm>
+                      <a:off x="0" y="0"/>
+                      <a:ext cx="5486400" cy="5057140"/>
+                    </a:xfrm>
+                    <a:prstGeom prst="rect">
+                      <a:avLst/>
+                    </a:prstGeom>
+                  </pic:spPr>
+                </pic:pic>
+              </a:graphicData>
+            </a:graphic>
+          </wp:inline>
+        </w:drawing>
+      </w:r>
+      <w:bookmarkEnd w:id="0"/>
     </w:p>
     <w:sectPr>
       <w:pgSz w:w="12240" w:h="15840"/>
@@ -12247,7 +12279,7 @@
 </file>
 
 <file path=customXml/itemProps1.xml><?xml version="1.0" encoding="utf-8"?>
-<ds:datastoreItem xmlns:ds="http://schemas.openxmlformats.org/officeDocument/2006/customXml" ds:itemID="{F1E8617A-E44D-4BAC-8416-C1C59BB7A616}">
+<ds:datastoreItem xmlns:ds="http://schemas.openxmlformats.org/officeDocument/2006/customXml" ds:itemID="{ADD02C7D-2C5C-4D7F-BF53-594415F3C830}">
   <ds:schemaRefs>
     <ds:schemaRef ds:uri="http://schemas.openxmlformats.org/officeDocument/2006/bibliography"/>
   </ds:schemaRefs>

</xml_diff>